<commit_message>
att timbrado e requerimentos
</commit_message>
<xml_diff>
--- a/static/documentos/Timbre.docx
+++ b/static/documentos/Timbre.docx
@@ -1,6 +1,6 @@
 
 <file path=word/document.xml><?xml version="1.0" encoding="utf-8"?>
-<w:document xmlns:wpc="http://schemas.microsoft.com/office/word/2010/wordprocessingCanvas" xmlns:cx="http://schemas.microsoft.com/office/drawing/2014/chartex" xmlns:cx1="http://schemas.microsoft.com/office/drawing/2015/9/8/chartex" xmlns:cx2="http://schemas.microsoft.com/office/drawing/2015/10/21/chartex" xmlns:cx3="http://schemas.microsoft.com/office/drawing/2016/5/9/chartex" xmlns:cx4="http://schemas.microsoft.com/office/drawing/2016/5/10/chartex" xmlns:cx5="http://schemas.microsoft.com/office/drawing/2016/5/11/chartex" xmlns:cx6="http://schemas.microsoft.com/office/drawing/2016/5/12/chartex" xmlns:cx7="http://schemas.microsoft.com/office/drawing/2016/5/13/chartex" xmlns:cx8="http://schemas.microsoft.com/office/drawing/2016/5/14/chartex" xmlns:mc="http://schemas.openxmlformats.org/markup-compatibility/2006" xmlns:aink="http://schemas.microsoft.com/office/drawing/2016/ink" xmlns:am3d="http://schemas.microsoft.com/office/drawing/2017/model3d" xmlns:o="urn:schemas-microsoft-com:office:office" xmlns:r="http://schemas.openxmlformats.org/officeDocument/2006/relationships" xmlns:m="http://schemas.openxmlformats.org/officeDocument/2006/math" xmlns:v="urn:schemas-microsoft-com:vml" xmlns:wp14="http://schemas.microsoft.com/office/word/2010/wordprocessingDrawing" xmlns:wp="http://schemas.openxmlformats.org/drawingml/2006/wordprocessingDrawing" xmlns:w10="urn:schemas-microsoft-com:office:word" xmlns:w="http://schemas.openxmlformats.org/wordprocessingml/2006/main" xmlns:w14="http://schemas.microsoft.com/office/word/2010/wordml" xmlns:w15="http://schemas.microsoft.com/office/word/2012/wordml" xmlns:w16cex="http://schemas.microsoft.com/office/word/2018/wordml/cex" xmlns:w16cid="http://schemas.microsoft.com/office/word/2016/wordml/cid" xmlns:w16="http://schemas.microsoft.com/office/word/2018/wordml" xmlns:w16sdtdh="http://schemas.microsoft.com/office/word/2020/wordml/sdtdatahash" xmlns:w16se="http://schemas.microsoft.com/office/word/2015/wordml/symex" xmlns:wpg="http://schemas.microsoft.com/office/word/2010/wordprocessingGroup" xmlns:wpi="http://schemas.microsoft.com/office/word/2010/wordprocessingInk" xmlns:wne="http://schemas.microsoft.com/office/word/2006/wordml" xmlns:wps="http://schemas.microsoft.com/office/word/2010/wordprocessingShape" mc:Ignorable="w14 w15 w16se w16cid w16 w16cex w16sdtdh wp14">
+<w:document xmlns:wpc="http://schemas.microsoft.com/office/word/2010/wordprocessingCanvas" xmlns:cx="http://schemas.microsoft.com/office/drawing/2014/chartex" xmlns:cx1="http://schemas.microsoft.com/office/drawing/2015/9/8/chartex" xmlns:cx2="http://schemas.microsoft.com/office/drawing/2015/10/21/chartex" xmlns:cx3="http://schemas.microsoft.com/office/drawing/2016/5/9/chartex" xmlns:cx4="http://schemas.microsoft.com/office/drawing/2016/5/10/chartex" xmlns:cx5="http://schemas.microsoft.com/office/drawing/2016/5/11/chartex" xmlns:cx6="http://schemas.microsoft.com/office/drawing/2016/5/12/chartex" xmlns:cx7="http://schemas.microsoft.com/office/drawing/2016/5/13/chartex" xmlns:cx8="http://schemas.microsoft.com/office/drawing/2016/5/14/chartex" xmlns:mc="http://schemas.openxmlformats.org/markup-compatibility/2006" xmlns:aink="http://schemas.microsoft.com/office/drawing/2016/ink" xmlns:am3d="http://schemas.microsoft.com/office/drawing/2017/model3d" xmlns:o="urn:schemas-microsoft-com:office:office" xmlns:oel="http://schemas.microsoft.com/office/2019/extlst" xmlns:r="http://schemas.openxmlformats.org/officeDocument/2006/relationships" xmlns:m="http://schemas.openxmlformats.org/officeDocument/2006/math" xmlns:v="urn:schemas-microsoft-com:vml" xmlns:wp14="http://schemas.microsoft.com/office/word/2010/wordprocessingDrawing" xmlns:wp="http://schemas.openxmlformats.org/drawingml/2006/wordprocessingDrawing" xmlns:w10="urn:schemas-microsoft-com:office:word" xmlns:w="http://schemas.openxmlformats.org/wordprocessingml/2006/main" xmlns:w14="http://schemas.microsoft.com/office/word/2010/wordml" xmlns:w15="http://schemas.microsoft.com/office/word/2012/wordml" xmlns:w16cex="http://schemas.microsoft.com/office/word/2018/wordml/cex" xmlns:w16cid="http://schemas.microsoft.com/office/word/2016/wordml/cid" xmlns:w16="http://schemas.microsoft.com/office/word/2018/wordml" xmlns:w16sdtdh="http://schemas.microsoft.com/office/word/2020/wordml/sdtdatahash" xmlns:w16se="http://schemas.microsoft.com/office/word/2015/wordml/symex" xmlns:wpg="http://schemas.microsoft.com/office/word/2010/wordprocessingGroup" xmlns:wpi="http://schemas.microsoft.com/office/word/2010/wordprocessingInk" xmlns:wne="http://schemas.microsoft.com/office/word/2006/wordml" xmlns:wps="http://schemas.microsoft.com/office/word/2010/wordprocessingShape" mc:Ignorable="w14 w15 w16se w16cid w16 w16cex w16sdtdh wp14">
   <w:body>
     <w:p/>
     <w:sectPr>
@@ -18,13 +18,16 @@
 </file>
 
 <file path=word/endnotes.xml><?xml version="1.0" encoding="utf-8"?>
-<w:endnotes xmlns:wpc="http://schemas.microsoft.com/office/word/2010/wordprocessingCanvas" xmlns:cx="http://schemas.microsoft.com/office/drawing/2014/chartex" xmlns:cx1="http://schemas.microsoft.com/office/drawing/2015/9/8/chartex" xmlns:cx2="http://schemas.microsoft.com/office/drawing/2015/10/21/chartex" xmlns:cx3="http://schemas.microsoft.com/office/drawing/2016/5/9/chartex" xmlns:cx4="http://schemas.microsoft.com/office/drawing/2016/5/10/chartex" xmlns:cx5="http://schemas.microsoft.com/office/drawing/2016/5/11/chartex" xmlns:cx6="http://schemas.microsoft.com/office/drawing/2016/5/12/chartex" xmlns:cx7="http://schemas.microsoft.com/office/drawing/2016/5/13/chartex" xmlns:cx8="http://schemas.microsoft.com/office/drawing/2016/5/14/chartex" xmlns:mc="http://schemas.openxmlformats.org/markup-compatibility/2006" xmlns:aink="http://schemas.microsoft.com/office/drawing/2016/ink" xmlns:am3d="http://schemas.microsoft.com/office/drawing/2017/model3d" xmlns:o="urn:schemas-microsoft-com:office:office" xmlns:r="http://schemas.openxmlformats.org/officeDocument/2006/relationships" xmlns:m="http://schemas.openxmlformats.org/officeDocument/2006/math" xmlns:v="urn:schemas-microsoft-com:vml" xmlns:wp14="http://schemas.microsoft.com/office/word/2010/wordprocessingDrawing" xmlns:wp="http://schemas.openxmlformats.org/drawingml/2006/wordprocessingDrawing" xmlns:w10="urn:schemas-microsoft-com:office:word" xmlns:w="http://schemas.openxmlformats.org/wordprocessingml/2006/main" xmlns:w14="http://schemas.microsoft.com/office/word/2010/wordml" xmlns:w15="http://schemas.microsoft.com/office/word/2012/wordml" xmlns:w16cex="http://schemas.microsoft.com/office/word/2018/wordml/cex" xmlns:w16cid="http://schemas.microsoft.com/office/word/2016/wordml/cid" xmlns:w16="http://schemas.microsoft.com/office/word/2018/wordml" xmlns:w16sdtdh="http://schemas.microsoft.com/office/word/2020/wordml/sdtdatahash" xmlns:w16se="http://schemas.microsoft.com/office/word/2015/wordml/symex" xmlns:wpg="http://schemas.microsoft.com/office/word/2010/wordprocessingGroup" xmlns:wpi="http://schemas.microsoft.com/office/word/2010/wordprocessingInk" xmlns:wne="http://schemas.microsoft.com/office/word/2006/wordml" xmlns:wps="http://schemas.microsoft.com/office/word/2010/wordprocessingShape" mc:Ignorable="w14 w15 w16se w16cid w16 w16cex w16sdtdh wp14">
+<w:endnotes xmlns:wpc="http://schemas.microsoft.com/office/word/2010/wordprocessingCanvas" xmlns:cx="http://schemas.microsoft.com/office/drawing/2014/chartex" xmlns:cx1="http://schemas.microsoft.com/office/drawing/2015/9/8/chartex" xmlns:cx2="http://schemas.microsoft.com/office/drawing/2015/10/21/chartex" xmlns:cx3="http://schemas.microsoft.com/office/drawing/2016/5/9/chartex" xmlns:cx4="http://schemas.microsoft.com/office/drawing/2016/5/10/chartex" xmlns:cx5="http://schemas.microsoft.com/office/drawing/2016/5/11/chartex" xmlns:cx6="http://schemas.microsoft.com/office/drawing/2016/5/12/chartex" xmlns:cx7="http://schemas.microsoft.com/office/drawing/2016/5/13/chartex" xmlns:cx8="http://schemas.microsoft.com/office/drawing/2016/5/14/chartex" xmlns:mc="http://schemas.openxmlformats.org/markup-compatibility/2006" xmlns:aink="http://schemas.microsoft.com/office/drawing/2016/ink" xmlns:am3d="http://schemas.microsoft.com/office/drawing/2017/model3d" xmlns:o="urn:schemas-microsoft-com:office:office" xmlns:oel="http://schemas.microsoft.com/office/2019/extlst" xmlns:r="http://schemas.openxmlformats.org/officeDocument/2006/relationships" xmlns:m="http://schemas.openxmlformats.org/officeDocument/2006/math" xmlns:v="urn:schemas-microsoft-com:vml" xmlns:wp14="http://schemas.microsoft.com/office/word/2010/wordprocessingDrawing" xmlns:wp="http://schemas.openxmlformats.org/drawingml/2006/wordprocessingDrawing" xmlns:w10="urn:schemas-microsoft-com:office:word" xmlns:w="http://schemas.openxmlformats.org/wordprocessingml/2006/main" xmlns:w14="http://schemas.microsoft.com/office/word/2010/wordml" xmlns:w15="http://schemas.microsoft.com/office/word/2012/wordml" xmlns:w16cex="http://schemas.microsoft.com/office/word/2018/wordml/cex" xmlns:w16cid="http://schemas.microsoft.com/office/word/2016/wordml/cid" xmlns:w16="http://schemas.microsoft.com/office/word/2018/wordml" xmlns:w16sdtdh="http://schemas.microsoft.com/office/word/2020/wordml/sdtdatahash" xmlns:w16se="http://schemas.microsoft.com/office/word/2015/wordml/symex" xmlns:wpg="http://schemas.microsoft.com/office/word/2010/wordprocessingGroup" xmlns:wpi="http://schemas.microsoft.com/office/word/2010/wordprocessingInk" xmlns:wne="http://schemas.microsoft.com/office/word/2006/wordml" xmlns:wps="http://schemas.microsoft.com/office/word/2010/wordprocessingShape" mc:Ignorable="w14 w15 w16se w16cid w16 w16cex w16sdtdh wp14">
   <w:endnote w:type="separator" w:id="-1">
     <w:p>
       <w:pPr>
         <w:spacing w:after="0" w:line="240" w:lineRule="auto"/>
       </w:pPr>
       <w:r>
+        <w:rPr>
+          <w:lang w:val="pt"/>
+        </w:rPr>
         <w:separator/>
       </w:r>
     </w:p>
@@ -35,6 +38,9 @@
         <w:spacing w:after="0" w:line="240" w:lineRule="auto"/>
       </w:pPr>
       <w:r>
+        <w:rPr>
+          <w:lang w:val="pt"/>
+        </w:rPr>
         <w:continuationSeparator/>
       </w:r>
     </w:p>
@@ -43,7 +49,7 @@
 </file>
 
 <file path=word/footer1.xml><?xml version="1.0" encoding="utf-8"?>
-<w:ftr xmlns:wpc="http://schemas.microsoft.com/office/word/2010/wordprocessingCanvas" xmlns:cx="http://schemas.microsoft.com/office/drawing/2014/chartex" xmlns:cx1="http://schemas.microsoft.com/office/drawing/2015/9/8/chartex" xmlns:cx2="http://schemas.microsoft.com/office/drawing/2015/10/21/chartex" xmlns:cx3="http://schemas.microsoft.com/office/drawing/2016/5/9/chartex" xmlns:cx4="http://schemas.microsoft.com/office/drawing/2016/5/10/chartex" xmlns:cx5="http://schemas.microsoft.com/office/drawing/2016/5/11/chartex" xmlns:cx6="http://schemas.microsoft.com/office/drawing/2016/5/12/chartex" xmlns:cx7="http://schemas.microsoft.com/office/drawing/2016/5/13/chartex" xmlns:cx8="http://schemas.microsoft.com/office/drawing/2016/5/14/chartex" xmlns:mc="http://schemas.openxmlformats.org/markup-compatibility/2006" xmlns:aink="http://schemas.microsoft.com/office/drawing/2016/ink" xmlns:am3d="http://schemas.microsoft.com/office/drawing/2017/model3d" xmlns:o="urn:schemas-microsoft-com:office:office" xmlns:r="http://schemas.openxmlformats.org/officeDocument/2006/relationships" xmlns:m="http://schemas.openxmlformats.org/officeDocument/2006/math" xmlns:v="urn:schemas-microsoft-com:vml" xmlns:wp14="http://schemas.microsoft.com/office/word/2010/wordprocessingDrawing" xmlns:wp="http://schemas.openxmlformats.org/drawingml/2006/wordprocessingDrawing" xmlns:w10="urn:schemas-microsoft-com:office:word" xmlns:w="http://schemas.openxmlformats.org/wordprocessingml/2006/main" xmlns:w14="http://schemas.microsoft.com/office/word/2010/wordml" xmlns:w15="http://schemas.microsoft.com/office/word/2012/wordml" xmlns:w16cex="http://schemas.microsoft.com/office/word/2018/wordml/cex" xmlns:w16cid="http://schemas.microsoft.com/office/word/2016/wordml/cid" xmlns:w16="http://schemas.microsoft.com/office/word/2018/wordml" xmlns:w16sdtdh="http://schemas.microsoft.com/office/word/2020/wordml/sdtdatahash" xmlns:w16se="http://schemas.microsoft.com/office/word/2015/wordml/symex" xmlns:wpg="http://schemas.microsoft.com/office/word/2010/wordprocessingGroup" xmlns:wpi="http://schemas.microsoft.com/office/word/2010/wordprocessingInk" xmlns:wne="http://schemas.microsoft.com/office/word/2006/wordml" xmlns:wps="http://schemas.microsoft.com/office/word/2010/wordprocessingShape" mc:Ignorable="w14 w15 w16se w16cid w16 w16cex w16sdtdh wp14">
+<w:ftr xmlns:wpc="http://schemas.microsoft.com/office/word/2010/wordprocessingCanvas" xmlns:cx="http://schemas.microsoft.com/office/drawing/2014/chartex" xmlns:cx1="http://schemas.microsoft.com/office/drawing/2015/9/8/chartex" xmlns:cx2="http://schemas.microsoft.com/office/drawing/2015/10/21/chartex" xmlns:cx3="http://schemas.microsoft.com/office/drawing/2016/5/9/chartex" xmlns:cx4="http://schemas.microsoft.com/office/drawing/2016/5/10/chartex" xmlns:cx5="http://schemas.microsoft.com/office/drawing/2016/5/11/chartex" xmlns:cx6="http://schemas.microsoft.com/office/drawing/2016/5/12/chartex" xmlns:cx7="http://schemas.microsoft.com/office/drawing/2016/5/13/chartex" xmlns:cx8="http://schemas.microsoft.com/office/drawing/2016/5/14/chartex" xmlns:mc="http://schemas.openxmlformats.org/markup-compatibility/2006" xmlns:aink="http://schemas.microsoft.com/office/drawing/2016/ink" xmlns:am3d="http://schemas.microsoft.com/office/drawing/2017/model3d" xmlns:o="urn:schemas-microsoft-com:office:office" xmlns:oel="http://schemas.microsoft.com/office/2019/extlst" xmlns:r="http://schemas.openxmlformats.org/officeDocument/2006/relationships" xmlns:m="http://schemas.openxmlformats.org/officeDocument/2006/math" xmlns:v="urn:schemas-microsoft-com:vml" xmlns:wp14="http://schemas.microsoft.com/office/word/2010/wordprocessingDrawing" xmlns:wp="http://schemas.openxmlformats.org/drawingml/2006/wordprocessingDrawing" xmlns:w10="urn:schemas-microsoft-com:office:word" xmlns:w="http://schemas.openxmlformats.org/wordprocessingml/2006/main" xmlns:w14="http://schemas.microsoft.com/office/word/2010/wordml" xmlns:w15="http://schemas.microsoft.com/office/word/2012/wordml" xmlns:w16cex="http://schemas.microsoft.com/office/word/2018/wordml/cex" xmlns:w16cid="http://schemas.microsoft.com/office/word/2016/wordml/cid" xmlns:w16="http://schemas.microsoft.com/office/word/2018/wordml" xmlns:w16sdtdh="http://schemas.microsoft.com/office/word/2020/wordml/sdtdatahash" xmlns:w16se="http://schemas.microsoft.com/office/word/2015/wordml/symex" xmlns:wpg="http://schemas.microsoft.com/office/word/2010/wordprocessingGroup" xmlns:wpi="http://schemas.microsoft.com/office/word/2010/wordprocessingInk" xmlns:wne="http://schemas.microsoft.com/office/word/2006/wordml" xmlns:wps="http://schemas.microsoft.com/office/word/2010/wordprocessingShape" mc:Ignorable="w14 w15 w16se w16cid w16 w16cex w16sdtdh wp14">
   <w:sdt>
     <w:sdtPr>
       <w:rPr>
@@ -78,7 +84,6 @@
             <w:docPartUnique/>
           </w:docPartObj>
         </w:sdtPr>
-        <w:sdtEndPr/>
         <w:sdtContent>
           <w:p>
             <w:pPr>
@@ -107,134 +112,134 @@
             </w:pPr>
             <w:r>
               <w:rPr>
-                <w:rFonts w:ascii="Arial" w:hAnsi="Arial" w:cs="Arial"/>
                 <w:sz w:val="20"/>
                 <w:szCs w:val="20"/>
+                <w:lang w:val="pt"/>
               </w:rPr>
               <w:t>Centenário do Sul – Paraná</w:t>
             </w:r>
             <w:r>
               <w:rPr>
-                <w:rFonts w:ascii="Arial" w:hAnsi="Arial" w:cs="Arial"/>
                 <w:sz w:val="20"/>
                 <w:szCs w:val="20"/>
+                <w:lang w:val="pt"/>
               </w:rPr>
               <w:tab/>
             </w:r>
             <w:r>
               <w:rPr>
-                <w:rFonts w:ascii="Arial" w:hAnsi="Arial" w:cs="Arial"/>
                 <w:sz w:val="20"/>
                 <w:szCs w:val="20"/>
+                <w:lang w:val="pt"/>
               </w:rPr>
               <w:t xml:space="preserve">Página </w:t>
             </w:r>
             <w:r>
               <w:rPr>
-                <w:rFonts w:ascii="Arial" w:hAnsi="Arial" w:cs="Arial"/>
                 <w:bCs/>
                 <w:sz w:val="20"/>
                 <w:szCs w:val="20"/>
+                <w:lang w:val="pt"/>
               </w:rPr>
               <w:fldChar w:fldCharType="begin"/>
             </w:r>
             <w:r>
               <w:rPr>
-                <w:rFonts w:ascii="Arial" w:hAnsi="Arial" w:cs="Arial"/>
                 <w:bCs/>
                 <w:sz w:val="20"/>
                 <w:szCs w:val="20"/>
+                <w:lang w:val="pt"/>
               </w:rPr>
               <w:instrText>PAGE</w:instrText>
             </w:r>
             <w:r>
               <w:rPr>
-                <w:rFonts w:ascii="Arial" w:hAnsi="Arial" w:cs="Arial"/>
                 <w:bCs/>
                 <w:sz w:val="20"/>
                 <w:szCs w:val="20"/>
+                <w:lang w:val="pt"/>
               </w:rPr>
               <w:fldChar w:fldCharType="separate"/>
             </w:r>
             <w:r>
               <w:rPr>
-                <w:rFonts w:ascii="Arial" w:hAnsi="Arial" w:cs="Arial"/>
                 <w:bCs/>
                 <w:noProof/>
                 <w:sz w:val="20"/>
                 <w:szCs w:val="20"/>
+                <w:lang w:val="pt"/>
               </w:rPr>
               <w:t>1</w:t>
             </w:r>
             <w:r>
               <w:rPr>
-                <w:rFonts w:ascii="Arial" w:hAnsi="Arial" w:cs="Arial"/>
                 <w:bCs/>
                 <w:sz w:val="20"/>
                 <w:szCs w:val="20"/>
+                <w:lang w:val="pt"/>
               </w:rPr>
               <w:fldChar w:fldCharType="end"/>
             </w:r>
             <w:r>
               <w:rPr>
-                <w:rFonts w:ascii="Arial" w:hAnsi="Arial" w:cs="Arial"/>
                 <w:sz w:val="20"/>
                 <w:szCs w:val="20"/>
+                <w:lang w:val="pt"/>
               </w:rPr>
               <w:t xml:space="preserve"> de </w:t>
             </w:r>
             <w:r>
               <w:rPr>
-                <w:rFonts w:ascii="Arial" w:hAnsi="Arial" w:cs="Arial"/>
                 <w:bCs/>
                 <w:sz w:val="20"/>
                 <w:szCs w:val="20"/>
+                <w:lang w:val="pt"/>
               </w:rPr>
               <w:fldChar w:fldCharType="begin"/>
             </w:r>
             <w:r>
               <w:rPr>
-                <w:rFonts w:ascii="Arial" w:hAnsi="Arial" w:cs="Arial"/>
                 <w:bCs/>
                 <w:sz w:val="20"/>
                 <w:szCs w:val="20"/>
+                <w:lang w:val="pt"/>
               </w:rPr>
               <w:instrText>NUMPAGES</w:instrText>
             </w:r>
             <w:r>
               <w:rPr>
-                <w:rFonts w:ascii="Arial" w:hAnsi="Arial" w:cs="Arial"/>
                 <w:bCs/>
                 <w:sz w:val="20"/>
                 <w:szCs w:val="20"/>
+                <w:lang w:val="pt"/>
               </w:rPr>
               <w:fldChar w:fldCharType="separate"/>
             </w:r>
             <w:r>
               <w:rPr>
-                <w:rFonts w:ascii="Arial" w:hAnsi="Arial" w:cs="Arial"/>
                 <w:bCs/>
                 <w:noProof/>
                 <w:sz w:val="20"/>
                 <w:szCs w:val="20"/>
+                <w:lang w:val="pt"/>
               </w:rPr>
               <w:t>1</w:t>
             </w:r>
             <w:r>
               <w:rPr>
-                <w:rFonts w:ascii="Arial" w:hAnsi="Arial" w:cs="Arial"/>
                 <w:bCs/>
                 <w:sz w:val="20"/>
                 <w:szCs w:val="20"/>
+                <w:lang w:val="pt"/>
               </w:rPr>
               <w:fldChar w:fldCharType="end"/>
             </w:r>
             <w:r>
               <w:rPr>
-                <w:rFonts w:ascii="Arial" w:hAnsi="Arial" w:cs="Arial"/>
                 <w:bCs/>
                 <w:sz w:val="20"/>
                 <w:szCs w:val="20"/>
+                <w:lang w:val="pt"/>
               </w:rPr>
               <w:tab/>
               <w:t>Governo Municipal</w:t>
@@ -248,13 +253,16 @@
 </file>
 
 <file path=word/footnotes.xml><?xml version="1.0" encoding="utf-8"?>
-<w:footnotes xmlns:wpc="http://schemas.microsoft.com/office/word/2010/wordprocessingCanvas" xmlns:cx="http://schemas.microsoft.com/office/drawing/2014/chartex" xmlns:cx1="http://schemas.microsoft.com/office/drawing/2015/9/8/chartex" xmlns:cx2="http://schemas.microsoft.com/office/drawing/2015/10/21/chartex" xmlns:cx3="http://schemas.microsoft.com/office/drawing/2016/5/9/chartex" xmlns:cx4="http://schemas.microsoft.com/office/drawing/2016/5/10/chartex" xmlns:cx5="http://schemas.microsoft.com/office/drawing/2016/5/11/chartex" xmlns:cx6="http://schemas.microsoft.com/office/drawing/2016/5/12/chartex" xmlns:cx7="http://schemas.microsoft.com/office/drawing/2016/5/13/chartex" xmlns:cx8="http://schemas.microsoft.com/office/drawing/2016/5/14/chartex" xmlns:mc="http://schemas.openxmlformats.org/markup-compatibility/2006" xmlns:aink="http://schemas.microsoft.com/office/drawing/2016/ink" xmlns:am3d="http://schemas.microsoft.com/office/drawing/2017/model3d" xmlns:o="urn:schemas-microsoft-com:office:office" xmlns:r="http://schemas.openxmlformats.org/officeDocument/2006/relationships" xmlns:m="http://schemas.openxmlformats.org/officeDocument/2006/math" xmlns:v="urn:schemas-microsoft-com:vml" xmlns:wp14="http://schemas.microsoft.com/office/word/2010/wordprocessingDrawing" xmlns:wp="http://schemas.openxmlformats.org/drawingml/2006/wordprocessingDrawing" xmlns:w10="urn:schemas-microsoft-com:office:word" xmlns:w="http://schemas.openxmlformats.org/wordprocessingml/2006/main" xmlns:w14="http://schemas.microsoft.com/office/word/2010/wordml" xmlns:w15="http://schemas.microsoft.com/office/word/2012/wordml" xmlns:w16cex="http://schemas.microsoft.com/office/word/2018/wordml/cex" xmlns:w16cid="http://schemas.microsoft.com/office/word/2016/wordml/cid" xmlns:w16="http://schemas.microsoft.com/office/word/2018/wordml" xmlns:w16sdtdh="http://schemas.microsoft.com/office/word/2020/wordml/sdtdatahash" xmlns:w16se="http://schemas.microsoft.com/office/word/2015/wordml/symex" xmlns:wpg="http://schemas.microsoft.com/office/word/2010/wordprocessingGroup" xmlns:wpi="http://schemas.microsoft.com/office/word/2010/wordprocessingInk" xmlns:wne="http://schemas.microsoft.com/office/word/2006/wordml" xmlns:wps="http://schemas.microsoft.com/office/word/2010/wordprocessingShape" mc:Ignorable="w14 w15 w16se w16cid w16 w16cex w16sdtdh wp14">
+<w:footnotes xmlns:wpc="http://schemas.microsoft.com/office/word/2010/wordprocessingCanvas" xmlns:cx="http://schemas.microsoft.com/office/drawing/2014/chartex" xmlns:cx1="http://schemas.microsoft.com/office/drawing/2015/9/8/chartex" xmlns:cx2="http://schemas.microsoft.com/office/drawing/2015/10/21/chartex" xmlns:cx3="http://schemas.microsoft.com/office/drawing/2016/5/9/chartex" xmlns:cx4="http://schemas.microsoft.com/office/drawing/2016/5/10/chartex" xmlns:cx5="http://schemas.microsoft.com/office/drawing/2016/5/11/chartex" xmlns:cx6="http://schemas.microsoft.com/office/drawing/2016/5/12/chartex" xmlns:cx7="http://schemas.microsoft.com/office/drawing/2016/5/13/chartex" xmlns:cx8="http://schemas.microsoft.com/office/drawing/2016/5/14/chartex" xmlns:mc="http://schemas.openxmlformats.org/markup-compatibility/2006" xmlns:aink="http://schemas.microsoft.com/office/drawing/2016/ink" xmlns:am3d="http://schemas.microsoft.com/office/drawing/2017/model3d" xmlns:o="urn:schemas-microsoft-com:office:office" xmlns:oel="http://schemas.microsoft.com/office/2019/extlst" xmlns:r="http://schemas.openxmlformats.org/officeDocument/2006/relationships" xmlns:m="http://schemas.openxmlformats.org/officeDocument/2006/math" xmlns:v="urn:schemas-microsoft-com:vml" xmlns:wp14="http://schemas.microsoft.com/office/word/2010/wordprocessingDrawing" xmlns:wp="http://schemas.openxmlformats.org/drawingml/2006/wordprocessingDrawing" xmlns:w10="urn:schemas-microsoft-com:office:word" xmlns:w="http://schemas.openxmlformats.org/wordprocessingml/2006/main" xmlns:w14="http://schemas.microsoft.com/office/word/2010/wordml" xmlns:w15="http://schemas.microsoft.com/office/word/2012/wordml" xmlns:w16cex="http://schemas.microsoft.com/office/word/2018/wordml/cex" xmlns:w16cid="http://schemas.microsoft.com/office/word/2016/wordml/cid" xmlns:w16="http://schemas.microsoft.com/office/word/2018/wordml" xmlns:w16sdtdh="http://schemas.microsoft.com/office/word/2020/wordml/sdtdatahash" xmlns:w16se="http://schemas.microsoft.com/office/word/2015/wordml/symex" xmlns:wpg="http://schemas.microsoft.com/office/word/2010/wordprocessingGroup" xmlns:wpi="http://schemas.microsoft.com/office/word/2010/wordprocessingInk" xmlns:wne="http://schemas.microsoft.com/office/word/2006/wordml" xmlns:wps="http://schemas.microsoft.com/office/word/2010/wordprocessingShape" mc:Ignorable="w14 w15 w16se w16cid w16 w16cex w16sdtdh wp14">
   <w:footnote w:type="separator" w:id="-1">
     <w:p>
       <w:pPr>
         <w:spacing w:after="0" w:line="240" w:lineRule="auto"/>
       </w:pPr>
       <w:r>
+        <w:rPr>
+          <w:lang w:val="pt"/>
+        </w:rPr>
         <w:separator/>
       </w:r>
     </w:p>
@@ -265,6 +273,9 @@
         <w:spacing w:after="0" w:line="240" w:lineRule="auto"/>
       </w:pPr>
       <w:r>
+        <w:rPr>
+          <w:lang w:val="pt"/>
+        </w:rPr>
         <w:continuationSeparator/>
       </w:r>
     </w:p>
@@ -273,7 +284,7 @@
 </file>
 
 <file path=word/header1.xml><?xml version="1.0" encoding="utf-8"?>
-<w:hdr xmlns:wpc="http://schemas.microsoft.com/office/word/2010/wordprocessingCanvas" xmlns:cx="http://schemas.microsoft.com/office/drawing/2014/chartex" xmlns:cx1="http://schemas.microsoft.com/office/drawing/2015/9/8/chartex" xmlns:cx2="http://schemas.microsoft.com/office/drawing/2015/10/21/chartex" xmlns:cx3="http://schemas.microsoft.com/office/drawing/2016/5/9/chartex" xmlns:cx4="http://schemas.microsoft.com/office/drawing/2016/5/10/chartex" xmlns:cx5="http://schemas.microsoft.com/office/drawing/2016/5/11/chartex" xmlns:cx6="http://schemas.microsoft.com/office/drawing/2016/5/12/chartex" xmlns:cx7="http://schemas.microsoft.com/office/drawing/2016/5/13/chartex" xmlns:cx8="http://schemas.microsoft.com/office/drawing/2016/5/14/chartex" xmlns:mc="http://schemas.openxmlformats.org/markup-compatibility/2006" xmlns:aink="http://schemas.microsoft.com/office/drawing/2016/ink" xmlns:am3d="http://schemas.microsoft.com/office/drawing/2017/model3d" xmlns:o="urn:schemas-microsoft-com:office:office" xmlns:r="http://schemas.openxmlformats.org/officeDocument/2006/relationships" xmlns:m="http://schemas.openxmlformats.org/officeDocument/2006/math" xmlns:v="urn:schemas-microsoft-com:vml" xmlns:wp14="http://schemas.microsoft.com/office/word/2010/wordprocessingDrawing" xmlns:wp="http://schemas.openxmlformats.org/drawingml/2006/wordprocessingDrawing" xmlns:w10="urn:schemas-microsoft-com:office:word" xmlns:w="http://schemas.openxmlformats.org/wordprocessingml/2006/main" xmlns:w14="http://schemas.microsoft.com/office/word/2010/wordml" xmlns:w15="http://schemas.microsoft.com/office/word/2012/wordml" xmlns:w16cex="http://schemas.microsoft.com/office/word/2018/wordml/cex" xmlns:w16cid="http://schemas.microsoft.com/office/word/2016/wordml/cid" xmlns:w16="http://schemas.microsoft.com/office/word/2018/wordml" xmlns:w16sdtdh="http://schemas.microsoft.com/office/word/2020/wordml/sdtdatahash" xmlns:w16se="http://schemas.microsoft.com/office/word/2015/wordml/symex" xmlns:wpg="http://schemas.microsoft.com/office/word/2010/wordprocessingGroup" xmlns:wpi="http://schemas.microsoft.com/office/word/2010/wordprocessingInk" xmlns:wne="http://schemas.microsoft.com/office/word/2006/wordml" xmlns:wps="http://schemas.microsoft.com/office/word/2010/wordprocessingShape" mc:Ignorable="w14 w15 w16se w16cid w16 w16cex w16sdtdh wp14">
+<w:hdr xmlns:wpc="http://schemas.microsoft.com/office/word/2010/wordprocessingCanvas" xmlns:cx="http://schemas.microsoft.com/office/drawing/2014/chartex" xmlns:cx1="http://schemas.microsoft.com/office/drawing/2015/9/8/chartex" xmlns:cx2="http://schemas.microsoft.com/office/drawing/2015/10/21/chartex" xmlns:cx3="http://schemas.microsoft.com/office/drawing/2016/5/9/chartex" xmlns:cx4="http://schemas.microsoft.com/office/drawing/2016/5/10/chartex" xmlns:cx5="http://schemas.microsoft.com/office/drawing/2016/5/11/chartex" xmlns:cx6="http://schemas.microsoft.com/office/drawing/2016/5/12/chartex" xmlns:cx7="http://schemas.microsoft.com/office/drawing/2016/5/13/chartex" xmlns:cx8="http://schemas.microsoft.com/office/drawing/2016/5/14/chartex" xmlns:mc="http://schemas.openxmlformats.org/markup-compatibility/2006" xmlns:aink="http://schemas.microsoft.com/office/drawing/2016/ink" xmlns:am3d="http://schemas.microsoft.com/office/drawing/2017/model3d" xmlns:o="urn:schemas-microsoft-com:office:office" xmlns:oel="http://schemas.microsoft.com/office/2019/extlst" xmlns:r="http://schemas.openxmlformats.org/officeDocument/2006/relationships" xmlns:m="http://schemas.openxmlformats.org/officeDocument/2006/math" xmlns:v="urn:schemas-microsoft-com:vml" xmlns:wp14="http://schemas.microsoft.com/office/word/2010/wordprocessingDrawing" xmlns:wp="http://schemas.openxmlformats.org/drawingml/2006/wordprocessingDrawing" xmlns:w10="urn:schemas-microsoft-com:office:word" xmlns:w="http://schemas.openxmlformats.org/wordprocessingml/2006/main" xmlns:w14="http://schemas.microsoft.com/office/word/2010/wordml" xmlns:w15="http://schemas.microsoft.com/office/word/2012/wordml" xmlns:w16cex="http://schemas.microsoft.com/office/word/2018/wordml/cex" xmlns:w16cid="http://schemas.microsoft.com/office/word/2016/wordml/cid" xmlns:w16="http://schemas.microsoft.com/office/word/2018/wordml" xmlns:w16sdtdh="http://schemas.microsoft.com/office/word/2020/wordml/sdtdatahash" xmlns:w16se="http://schemas.microsoft.com/office/word/2015/wordml/symex" xmlns:wpg="http://schemas.microsoft.com/office/word/2010/wordprocessingGroup" xmlns:wpi="http://schemas.microsoft.com/office/word/2010/wordprocessingInk" xmlns:wne="http://schemas.microsoft.com/office/word/2006/wordml" xmlns:wps="http://schemas.microsoft.com/office/word/2010/wordprocessingShape" mc:Ignorable="w14 w15 w16se w16cid w16 w16cex w16sdtdh wp14">
   <w:p>
     <w:pPr>
       <w:pStyle w:val="Cabealho"/>
@@ -281,6 +292,7 @@
     <w:r>
       <w:rPr>
         <w:noProof/>
+        <w:lang w:val="pt"/>
       </w:rPr>
       <w:pict w14:anchorId="7D821795">
         <v:shapetype id="_x0000_t75" coordsize="21600,21600" o:spt="75" o:preferrelative="t" path="m@4@5l@4@11@9@11@9@5xe" filled="f" stroked="f">
@@ -313,7 +325,7 @@
 </file>
 
 <file path=word/header2.xml><?xml version="1.0" encoding="utf-8"?>
-<w:hdr xmlns:wpc="http://schemas.microsoft.com/office/word/2010/wordprocessingCanvas" xmlns:cx="http://schemas.microsoft.com/office/drawing/2014/chartex" xmlns:cx1="http://schemas.microsoft.com/office/drawing/2015/9/8/chartex" xmlns:cx2="http://schemas.microsoft.com/office/drawing/2015/10/21/chartex" xmlns:cx3="http://schemas.microsoft.com/office/drawing/2016/5/9/chartex" xmlns:cx4="http://schemas.microsoft.com/office/drawing/2016/5/10/chartex" xmlns:cx5="http://schemas.microsoft.com/office/drawing/2016/5/11/chartex" xmlns:cx6="http://schemas.microsoft.com/office/drawing/2016/5/12/chartex" xmlns:cx7="http://schemas.microsoft.com/office/drawing/2016/5/13/chartex" xmlns:cx8="http://schemas.microsoft.com/office/drawing/2016/5/14/chartex" xmlns:mc="http://schemas.openxmlformats.org/markup-compatibility/2006" xmlns:aink="http://schemas.microsoft.com/office/drawing/2016/ink" xmlns:am3d="http://schemas.microsoft.com/office/drawing/2017/model3d" xmlns:o="urn:schemas-microsoft-com:office:office" xmlns:r="http://schemas.openxmlformats.org/officeDocument/2006/relationships" xmlns:m="http://schemas.openxmlformats.org/officeDocument/2006/math" xmlns:v="urn:schemas-microsoft-com:vml" xmlns:wp14="http://schemas.microsoft.com/office/word/2010/wordprocessingDrawing" xmlns:wp="http://schemas.openxmlformats.org/drawingml/2006/wordprocessingDrawing" xmlns:w10="urn:schemas-microsoft-com:office:word" xmlns:w="http://schemas.openxmlformats.org/wordprocessingml/2006/main" xmlns:w14="http://schemas.microsoft.com/office/word/2010/wordml" xmlns:w15="http://schemas.microsoft.com/office/word/2012/wordml" xmlns:w16cex="http://schemas.microsoft.com/office/word/2018/wordml/cex" xmlns:w16cid="http://schemas.microsoft.com/office/word/2016/wordml/cid" xmlns:w16="http://schemas.microsoft.com/office/word/2018/wordml" xmlns:w16sdtdh="http://schemas.microsoft.com/office/word/2020/wordml/sdtdatahash" xmlns:w16se="http://schemas.microsoft.com/office/word/2015/wordml/symex" xmlns:wpg="http://schemas.microsoft.com/office/word/2010/wordprocessingGroup" xmlns:wpi="http://schemas.microsoft.com/office/word/2010/wordprocessingInk" xmlns:wne="http://schemas.microsoft.com/office/word/2006/wordml" xmlns:wps="http://schemas.microsoft.com/office/word/2010/wordprocessingShape" mc:Ignorable="w14 w15 w16se w16cid w16 w16cex w16sdtdh wp14">
+<w:hdr xmlns:wpc="http://schemas.microsoft.com/office/word/2010/wordprocessingCanvas" xmlns:cx="http://schemas.microsoft.com/office/drawing/2014/chartex" xmlns:cx1="http://schemas.microsoft.com/office/drawing/2015/9/8/chartex" xmlns:cx2="http://schemas.microsoft.com/office/drawing/2015/10/21/chartex" xmlns:cx3="http://schemas.microsoft.com/office/drawing/2016/5/9/chartex" xmlns:cx4="http://schemas.microsoft.com/office/drawing/2016/5/10/chartex" xmlns:cx5="http://schemas.microsoft.com/office/drawing/2016/5/11/chartex" xmlns:cx6="http://schemas.microsoft.com/office/drawing/2016/5/12/chartex" xmlns:cx7="http://schemas.microsoft.com/office/drawing/2016/5/13/chartex" xmlns:cx8="http://schemas.microsoft.com/office/drawing/2016/5/14/chartex" xmlns:mc="http://schemas.openxmlformats.org/markup-compatibility/2006" xmlns:aink="http://schemas.microsoft.com/office/drawing/2016/ink" xmlns:am3d="http://schemas.microsoft.com/office/drawing/2017/model3d" xmlns:o="urn:schemas-microsoft-com:office:office" xmlns:oel="http://schemas.microsoft.com/office/2019/extlst" xmlns:r="http://schemas.openxmlformats.org/officeDocument/2006/relationships" xmlns:m="http://schemas.openxmlformats.org/officeDocument/2006/math" xmlns:v="urn:schemas-microsoft-com:vml" xmlns:wp14="http://schemas.microsoft.com/office/word/2010/wordprocessingDrawing" xmlns:wp="http://schemas.openxmlformats.org/drawingml/2006/wordprocessingDrawing" xmlns:w10="urn:schemas-microsoft-com:office:word" xmlns:w="http://schemas.openxmlformats.org/wordprocessingml/2006/main" xmlns:w14="http://schemas.microsoft.com/office/word/2010/wordml" xmlns:w15="http://schemas.microsoft.com/office/word/2012/wordml" xmlns:w16cex="http://schemas.microsoft.com/office/word/2018/wordml/cex" xmlns:w16cid="http://schemas.microsoft.com/office/word/2016/wordml/cid" xmlns:w16="http://schemas.microsoft.com/office/word/2018/wordml" xmlns:w16sdtdh="http://schemas.microsoft.com/office/word/2020/wordml/sdtdatahash" xmlns:w16se="http://schemas.microsoft.com/office/word/2015/wordml/symex" xmlns:wpg="http://schemas.microsoft.com/office/word/2010/wordprocessingGroup" xmlns:wpi="http://schemas.microsoft.com/office/word/2010/wordprocessingInk" xmlns:wne="http://schemas.microsoft.com/office/word/2006/wordml" xmlns:wps="http://schemas.microsoft.com/office/word/2010/wordprocessingShape" mc:Ignorable="w14 w15 w16se w16cid w16 w16cex w16sdtdh wp14">
   <w:p>
     <w:pPr>
       <w:pStyle w:val="Cabealho"/>
@@ -325,11 +337,10 @@
     </w:pPr>
     <w:r>
       <w:rPr>
-        <w:rFonts w:ascii="Arial" w:hAnsi="Arial" w:cs="Arial"/>
         <w:noProof/>
         <w:sz w:val="20"/>
         <w:szCs w:val="20"/>
-        <w:lang w:eastAsia="pt-BR"/>
+        <w:lang w:val="pt"/>
       </w:rPr>
       <w:pict w14:anchorId="74C83EB9">
         <v:shapetype id="_x0000_t75" coordsize="21600,21600" o:spt="75" o:preferrelative="t" path="m@4@5l@4@11@9@11@9@5xe" filled="f" stroked="f">
@@ -359,281 +370,587 @@
     </w:r>
     <w:r>
       <w:rPr>
-        <w:rFonts w:ascii="Arial" w:hAnsi="Arial" w:cs="Arial"/>
         <w:noProof/>
         <w:sz w:val="20"/>
         <w:szCs w:val="20"/>
-        <w:lang w:eastAsia="pt-BR"/>
+        <w:lang w:val="pt"/>
       </w:rPr>
-      <w:pict w14:anchorId="569AC800">
-        <v:shapetype id="_x0000_t202" coordsize="21600,21600" o:spt="202" path="m,l,21600r21600,l21600,xe">
-          <v:stroke joinstyle="miter"/>
-          <v:path gradientshapeok="t" o:connecttype="rect"/>
-        </v:shapetype>
-        <v:shape id="Caixa de Texto 2" o:spid="_x0000_s1026" type="#_x0000_t202" style="position:absolute;margin-left:37.2pt;margin-top:-.3pt;width:430.5pt;height:80.15pt;z-index:251659264;visibility:visible;mso-wrap-distance-top:3.6pt;mso-wrap-distance-bottom:3.6pt;mso-width-relative:margin;mso-height-relative:margin" o:gfxdata="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" stroked="f">
-          <v:textbox style="mso-next-textbox:#Caixa de Texto 2">
-            <w:txbxContent>
-              <w:p>
-                <w:pPr>
-                  <w:rPr>
-                    <w:rFonts w:ascii="Arial" w:hAnsi="Arial" w:cs="Arial"/>
-                    <w:sz w:val="24"/>
-                    <w:szCs w:val="24"/>
-                    <w:lang w:val="pt-BR"/>
-                  </w:rPr>
-                </w:pPr>
-                <w:r>
-                  <w:rPr>
-                    <w:rFonts w:ascii="Arial Black" w:hAnsi="Arial Black"/>
-                    <w:sz w:val="28"/>
-                    <w:szCs w:val="28"/>
-                    <w:lang w:val="pt-BR"/>
-                  </w:rPr>
-                  <w:t xml:space="preserve">     </w:t>
-                </w:r>
-                <w:r>
-                  <w:rPr>
-                    <w:rFonts w:ascii="Arial Black" w:hAnsi="Arial Black"/>
-                    <w:sz w:val="28"/>
-                    <w:szCs w:val="28"/>
-                    <w:lang w:val="pt-BR"/>
-                  </w:rPr>
-                  <w:t>MUNICÍPIO DE CENTENÁRIO DO SUL</w:t>
-                </w:r>
-                <w:r>
-                  <w:rPr>
-                    <w:rFonts w:ascii="Arial Black" w:hAnsi="Arial Black"/>
-                    <w:sz w:val="28"/>
-                    <w:szCs w:val="28"/>
-                    <w:lang w:val="pt-BR"/>
-                  </w:rPr>
-                  <w:t xml:space="preserve"> – PARANÁ</w:t>
-                </w:r>
-                <w:r>
-                  <w:rPr>
-                    <w:lang w:val="pt-BR"/>
-                  </w:rPr>
-                  <w:br/>
-                </w:r>
-                <w:r>
-                  <w:rPr>
-                    <w:rFonts w:ascii="Arial" w:hAnsi="Arial" w:cs="Arial"/>
-                    <w:lang w:val="pt-BR"/>
-                  </w:rPr>
-                  <w:t>Paço Municipal Praça Padre</w:t>
-                </w:r>
-                <w:r>
-                  <w:rPr>
-                    <w:rFonts w:ascii="Arial" w:hAnsi="Arial" w:cs="Arial"/>
-                    <w:lang w:val="pt-BR"/>
-                  </w:rPr>
-                  <w:t xml:space="preserve"> </w:t>
-                </w:r>
-                <w:r>
-                  <w:rPr>
-                    <w:rFonts w:ascii="Arial" w:hAnsi="Arial" w:cs="Arial"/>
-                    <w:lang w:val="pt-BR"/>
-                  </w:rPr>
-                  <w:t>Aurélio</w:t>
-                </w:r>
-                <w:r>
-                  <w:rPr>
-                    <w:rFonts w:ascii="Arial" w:hAnsi="Arial" w:cs="Arial"/>
-                    <w:lang w:val="pt-BR"/>
-                  </w:rPr>
-                  <w:t xml:space="preserve"> </w:t>
-                </w:r>
-                <w:r>
-                  <w:rPr>
-                    <w:rFonts w:ascii="Arial" w:hAnsi="Arial" w:cs="Arial"/>
-                    <w:lang w:val="pt-BR"/>
-                  </w:rPr>
-                  <w:t>Basso, 378</w:t>
-                </w:r>
-                <w:r>
-                  <w:rPr>
-                    <w:rFonts w:ascii="Arial" w:hAnsi="Arial" w:cs="Arial"/>
-                    <w:lang w:val="pt-BR"/>
-                  </w:rPr>
-                  <w:t xml:space="preserve"> – Centro </w:t>
-                </w:r>
-                <w:r>
-                  <w:rPr>
-                    <w:rFonts w:ascii="Arial" w:hAnsi="Arial" w:cs="Arial"/>
-                    <w:lang w:val="pt-BR"/>
-                  </w:rPr>
-                  <w:t xml:space="preserve">         Estado do Paraná</w:t>
-                </w:r>
-                <w:r>
-                  <w:rPr>
-                    <w:rFonts w:ascii="Arial" w:hAnsi="Arial" w:cs="Arial"/>
-                    <w:lang w:val="pt-BR"/>
-                  </w:rPr>
-                  <w:br/>
-                </w:r>
-                <w:hyperlink r:id="rId2" w:history="1">
-                  <w:r>
-                    <w:rPr>
-                      <w:rStyle w:val="Hyperlink"/>
-                      <w:rFonts w:ascii="Arial" w:hAnsi="Arial" w:cs="Arial"/>
-                      <w:color w:val="000000" w:themeColor="text1"/>
-                      <w:u w:val="none"/>
-                      <w:lang w:val="pt-BR"/>
-                    </w:rPr>
-                    <w:t>www.centenariodosul.pr.gov.br</w:t>
-                  </w:r>
-                </w:hyperlink>
-                <w:r>
-                  <w:rPr>
-                    <w:rFonts w:ascii="Arial" w:hAnsi="Arial" w:cs="Arial"/>
-                    <w:lang w:val="pt-BR"/>
-                  </w:rPr>
-                  <w:t xml:space="preserve"> | </w:t>
-                </w:r>
-                <w:r>
-                  <w:rPr>
-                    <w:rFonts w:ascii="Arial" w:hAnsi="Arial" w:cs="Arial"/>
-                    <w:lang w:val="pt-BR"/>
-                  </w:rPr>
-                  <w:t>CNPJ: 75.845.503/0001-67</w:t>
-                </w:r>
-                <w:r>
-                  <w:rPr>
-                    <w:rFonts w:ascii="Arial" w:hAnsi="Arial" w:cs="Arial"/>
-                    <w:lang w:val="pt-BR"/>
-                  </w:rPr>
-                  <w:br/>
-                  <w:t>Fone:</w:t>
-                </w:r>
-                <w:r>
-                  <w:rPr>
-                    <w:rFonts w:ascii="Arial" w:hAnsi="Arial" w:cs="Arial"/>
-                    <w:lang w:val="pt-BR"/>
-                  </w:rPr>
-                  <w:t xml:space="preserve"> (43) 3675-80</w:t>
-                </w:r>
-                <w:r>
-                  <w:rPr>
-                    <w:rFonts w:ascii="Arial" w:hAnsi="Arial" w:cs="Arial"/>
-                    <w:lang w:val="pt-BR"/>
-                  </w:rPr>
-                  <w:t>0</w:t>
-                </w:r>
-                <w:r>
-                  <w:rPr>
-                    <w:rFonts w:ascii="Arial" w:hAnsi="Arial" w:cs="Arial"/>
-                    <w:lang w:val="pt-BR"/>
-                  </w:rPr>
-                  <w:t>0</w:t>
-                </w:r>
-                <w:r>
-                  <w:rPr>
-                    <w:rFonts w:ascii="Arial" w:hAnsi="Arial" w:cs="Arial"/>
-                    <w:lang w:val="pt-BR"/>
-                  </w:rPr>
-                  <w:t xml:space="preserve"> </w:t>
-                </w:r>
-                <w:r>
-                  <w:rPr>
-                    <w:rFonts w:ascii="Arial" w:hAnsi="Arial" w:cs="Arial"/>
-                    <w:lang w:val="pt-BR"/>
-                  </w:rPr>
-                  <w:t>|</w:t>
-                </w:r>
-                <w:r>
-                  <w:rPr>
-                    <w:rFonts w:ascii="Arial" w:hAnsi="Arial" w:cs="Arial"/>
-                    <w:lang w:val="pt-BR"/>
-                  </w:rPr>
-                  <w:t xml:space="preserve"> </w:t>
-                </w:r>
-                <w:r>
-                  <w:rPr>
-                    <w:rFonts w:ascii="Arial" w:hAnsi="Arial" w:cs="Arial"/>
-                    <w:lang w:val="pt-BR"/>
-                  </w:rPr>
-                  <w:t>CEP</w:t>
-                </w:r>
-                <w:r>
-                  <w:rPr>
-                    <w:rFonts w:ascii="Arial" w:hAnsi="Arial" w:cs="Arial"/>
-                    <w:lang w:val="pt-BR"/>
-                  </w:rPr>
-                  <w:t>:</w:t>
-                </w:r>
-                <w:r>
-                  <w:rPr>
-                    <w:rFonts w:ascii="Arial" w:hAnsi="Arial" w:cs="Arial"/>
-                    <w:lang w:val="pt-BR"/>
-                  </w:rPr>
-                  <w:t xml:space="preserve"> 86.630-000</w:t>
-                </w:r>
-                <w:r>
-                  <w:rPr>
-                    <w:rFonts w:ascii="Arial" w:hAnsi="Arial" w:cs="Arial"/>
-                    <w:lang w:val="pt-BR"/>
-                  </w:rPr>
-                  <w:t xml:space="preserve"> |</w:t>
-                </w:r>
-                <w:r>
-                  <w:rPr>
-                    <w:rFonts w:ascii="Arial" w:hAnsi="Arial" w:cs="Arial"/>
-                    <w:lang w:val="pt-BR"/>
-                  </w:rPr>
-                  <w:t xml:space="preserve"> </w:t>
-                </w:r>
-                <w:r>
-                  <w:rPr>
-                    <w:rFonts w:ascii="Arial" w:hAnsi="Arial" w:cs="Arial"/>
-                    <w:sz w:val="21"/>
-                    <w:lang w:val="pt-BR"/>
-                  </w:rPr>
-                  <w:t xml:space="preserve">E-mail: </w:t>
-                </w:r>
-                <w:r>
-                  <w:rPr>
-                    <w:rFonts w:ascii="Arial" w:hAnsi="Arial" w:cs="Arial"/>
-                    <w:sz w:val="21"/>
-                    <w:lang w:val="pt-BR"/>
-                  </w:rPr>
-                  <w:t>contato</w:t>
-                </w:r>
-                <w:r>
-                  <w:rPr>
-                    <w:rFonts w:ascii="Arial" w:hAnsi="Arial" w:cs="Arial"/>
-                    <w:sz w:val="21"/>
-                    <w:lang w:val="pt-BR"/>
-                  </w:rPr>
-                  <w:t>@centenariodosul.pr.gov.br</w:t>
-                </w:r>
-              </w:p>
-            </w:txbxContent>
-          </v:textbox>
-          <w10:wrap type="square"/>
-        </v:shape>
-      </w:pict>
+      <mc:AlternateContent>
+        <mc:Choice Requires="wps">
+          <w:drawing>
+            <wp:anchor distT="45720" distB="45720" distL="114300" distR="114300" simplePos="0" relativeHeight="251659264" behindDoc="0" locked="0" layoutInCell="1" allowOverlap="1" wp14:anchorId="569AC800" wp14:editId="4A1F0EFE">
+              <wp:simplePos x="0" y="0"/>
+              <wp:positionH relativeFrom="column">
+                <wp:posOffset>472440</wp:posOffset>
+              </wp:positionH>
+              <wp:positionV relativeFrom="paragraph">
+                <wp:posOffset>-3810</wp:posOffset>
+              </wp:positionV>
+              <wp:extent cx="5467350" cy="1017905"/>
+              <wp:effectExtent l="0" t="0" r="0" b="0"/>
+              <wp:wrapSquare wrapText="bothSides"/>
+              <wp:docPr id="217" name="Caixa de Texto 2"/>
+              <wp:cNvGraphicFramePr>
+                <a:graphicFrameLocks xmlns:a="http://schemas.openxmlformats.org/drawingml/2006/main"/>
+              </wp:cNvGraphicFramePr>
+              <a:graphic xmlns:a="http://schemas.openxmlformats.org/drawingml/2006/main">
+                <a:graphicData uri="http://schemas.microsoft.com/office/word/2010/wordprocessingShape">
+                  <wps:wsp>
+                    <wps:cNvSpPr txBox="1">
+                      <a:spLocks noChangeArrowheads="1"/>
+                    </wps:cNvSpPr>
+                    <wps:spPr bwMode="auto">
+                      <a:xfrm>
+                        <a:off x="0" y="0"/>
+                        <a:ext cx="5467350" cy="1017905"/>
+                      </a:xfrm>
+                      <a:prstGeom prst="rect">
+                        <a:avLst/>
+                      </a:prstGeom>
+                      <a:solidFill>
+                        <a:srgbClr val="FFFFFF"/>
+                      </a:solidFill>
+                      <a:ln w="9525">
+                        <a:noFill/>
+                        <a:miter lim="800000"/>
+                        <a:headEnd/>
+                        <a:tailEnd/>
+                      </a:ln>
+                    </wps:spPr>
+                    <wps:txbx>
+                      <w:txbxContent>
+                        <w:p>
+                          <w:pPr>
+                            <w:rPr>
+                              <w:rFonts w:ascii="Arial" w:hAnsi="Arial" w:cs="Arial"/>
+                              <w:sz w:val="24"/>
+                              <w:szCs w:val="24"/>
+                              <w:lang w:val="pt-BR"/>
+                            </w:rPr>
+                          </w:pPr>
+                          <w:r>
+                            <w:rPr>
+                              <w:sz w:val="28"/>
+                              <w:szCs w:val="28"/>
+                              <w:lang w:val="pt"/>
+                            </w:rPr>
+                            <w:t xml:space="preserve">     </w:t>
+                          </w:r>
+                          <w:r>
+                            <w:rPr>
+                              <w:sz w:val="28"/>
+                              <w:szCs w:val="28"/>
+                              <w:lang w:val="pt"/>
+                            </w:rPr>
+                            <w:t>MUNICÍPIO DE CENTENÁRIO DO SUL</w:t>
+                          </w:r>
+                          <w:r>
+                            <w:rPr>
+                              <w:sz w:val="28"/>
+                              <w:szCs w:val="28"/>
+                              <w:lang w:val="pt"/>
+                            </w:rPr>
+                            <w:t xml:space="preserve"> – PARANÁ</w:t>
+                          </w:r>
+                          <w:r>
+                            <w:rPr>
+                              <w:lang w:val="pt"/>
+                            </w:rPr>
+                            <w:br/>
+                          </w:r>
+                          <w:r>
+                            <w:rPr>
+                              <w:lang w:val="pt"/>
+                            </w:rPr>
+                            <w:t>Paço Municipal Praça Padre</w:t>
+                          </w:r>
+                          <w:r>
+                            <w:rPr>
+                              <w:lang w:val="pt"/>
+                            </w:rPr>
+                            <w:t xml:space="preserve"> </w:t>
+                          </w:r>
+                          <w:r>
+                            <w:rPr>
+                              <w:lang w:val="pt"/>
+                            </w:rPr>
+                            <w:t>Aurélio</w:t>
+                          </w:r>
+                          <w:r>
+                            <w:rPr>
+                              <w:lang w:val="pt"/>
+                            </w:rPr>
+                            <w:t xml:space="preserve"> </w:t>
+                          </w:r>
+                          <w:r>
+                            <w:rPr>
+                              <w:lang w:val="pt"/>
+                            </w:rPr>
+                            <w:t>Baixa, 378</w:t>
+                          </w:r>
+                          <w:r>
+                            <w:rPr>
+                              <w:lang w:val="pt"/>
+                            </w:rPr>
+                            <w:t xml:space="preserve"> –Centro </w:t>
+                          </w:r>
+                          <w:r>
+                            <w:rPr>
+                              <w:lang w:val="pt"/>
+                            </w:rPr>
+                            <w:t xml:space="preserve">         Estado do Paraná</w:t>
+                          </w:r>
+                          <w:r>
+                            <w:rPr>
+                              <w:lang w:val="pt"/>
+                            </w:rPr>
+                            <w:br/>
+                          </w:r>
+                          <w:hyperlink r:id="rId2" w:history="1">
+                            <w:r>
+                              <w:rPr>
+                                <w:rStyle w:val="Hyperlink"/>
+                                <w:color w:val="000000" w:themeColor="text1"/>
+                                <w:u w:val="none"/>
+                                <w:lang w:val="pt"/>
+                              </w:rPr>
+                              <w:t>www.centenariodosul.pr.gov.br</w:t>
+                            </w:r>
+                          </w:hyperlink>
+                          <w:r>
+                            <w:rPr>
+                              <w:lang w:val="pt"/>
+                            </w:rPr>
+                            <w:t xml:space="preserve"> | </w:t>
+                          </w:r>
+                          <w:r>
+                            <w:rPr>
+                              <w:lang w:val="pt"/>
+                            </w:rPr>
+                            <w:t>CNPJ: 75.845.503/0001-67</w:t>
+                          </w:r>
+                          <w:r>
+                            <w:rPr>
+                              <w:lang w:val="pt"/>
+                            </w:rPr>
+                            <w:br/>
+                            <w:t>Fone:</w:t>
+                          </w:r>
+                          <w:r>
+                            <w:rPr>
+                              <w:lang w:val="pt"/>
+                            </w:rPr>
+                            <w:t xml:space="preserve"> (43) 3675-80</w:t>
+                          </w:r>
+                          <w:r>
+                            <w:rPr>
+                              <w:lang w:val="pt"/>
+                            </w:rPr>
+                            <w:t>0</w:t>
+                          </w:r>
+                          <w:r>
+                            <w:rPr>
+                              <w:lang w:val="pt"/>
+                            </w:rPr>
+                            <w:t>0</w:t>
+                          </w:r>
+                          <w:r>
+                            <w:rPr>
+                              <w:lang w:val="pt"/>
+                            </w:rPr>
+                            <w:t xml:space="preserve"> </w:t>
+                          </w:r>
+                          <w:r>
+                            <w:rPr>
+                              <w:lang w:val="pt"/>
+                            </w:rPr>
+                            <w:t>|</w:t>
+                          </w:r>
+                          <w:r>
+                            <w:rPr>
+                              <w:lang w:val="pt"/>
+                            </w:rPr>
+                            <w:t xml:space="preserve"> </w:t>
+                          </w:r>
+                          <w:r>
+                            <w:rPr>
+                              <w:lang w:val="pt"/>
+                            </w:rPr>
+                            <w:t>BOLSO</w:t>
+                          </w:r>
+                          <w:r>
+                            <w:rPr>
+                              <w:lang w:val="pt"/>
+                            </w:rPr>
+                            <w:t>:</w:t>
+                          </w:r>
+                          <w:r>
+                            <w:rPr>
+                              <w:lang w:val="pt"/>
+                            </w:rPr>
+                            <w:t xml:space="preserve"> 86.630-000</w:t>
+                          </w:r>
+                          <w:r>
+                            <w:rPr>
+                              <w:lang w:val="pt"/>
+                            </w:rPr>
+                            <w:t xml:space="preserve"> |</w:t>
+                          </w:r>
+                          <w:r>
+                            <w:rPr>
+                              <w:lang w:val="pt"/>
+                            </w:rPr>
+                            <w:t xml:space="preserve"> </w:t>
+                          </w:r>
+                          <w:r>
+                            <w:rPr>
+                              <w:sz w:val="21"/>
+                              <w:lang w:val="pt"/>
+                            </w:rPr>
+                            <w:t xml:space="preserve">E-mail: </w:t>
+                          </w:r>
+                          <w:r>
+                            <w:rPr>
+                              <w:sz w:val="21"/>
+                              <w:lang w:val="pt"/>
+                            </w:rPr>
+                            <w:t>contato</w:t>
+                          </w:r>
+                          <w:r>
+                            <w:rPr>
+                              <w:sz w:val="21"/>
+                              <w:lang w:val="pt"/>
+                            </w:rPr>
+                            <w:t>@centenariodosul.pr.gov.br</w:t>
+                          </w:r>
+                        </w:p>
+                      </w:txbxContent>
+                    </wps:txbx>
+                    <wps:bodyPr rot="0" vert="horz" wrap="square" lIns="91440" tIns="45720" rIns="91440" bIns="45720" anchor="t" anchorCtr="0">
+                      <a:noAutofit/>
+                    </wps:bodyPr>
+                  </wps:wsp>
+                </a:graphicData>
+              </a:graphic>
+              <wp14:sizeRelH relativeFrom="margin">
+                <wp14:pctWidth>0</wp14:pctWidth>
+              </wp14:sizeRelH>
+              <wp14:sizeRelV relativeFrom="margin">
+                <wp14:pctHeight>0</wp14:pctHeight>
+              </wp14:sizeRelV>
+            </wp:anchor>
+          </w:drawing>
+        </mc:Choice>
+        <mc:Fallback>
+          <w:pict>
+            <v:shapetype w14:anchorId="569AC800" id="_x0000_t202" coordsize="21600,21600" o:spt="202" path="m,l,21600r21600,l21600,xe">
+              <v:stroke joinstyle="miter"/>
+              <v:path gradientshapeok="t" o:connecttype="rect"/>
+            </v:shapetype>
+            <v:shape id="Caixa de Texto 2" o:spid="_x0000_s1026" type="#_x0000_t202" style="position:absolute;margin-left:37.2pt;margin-top:-.3pt;width:430.5pt;height:80.15pt;z-index:251659264;visibility:visible;mso-wrap-style:square;mso-width-percent:0;mso-height-percent:0;mso-wrap-distance-left:9pt;mso-wrap-distance-top:3.6pt;mso-wrap-distance-right:9pt;mso-wrap-distance-bottom:3.6pt;mso-position-horizontal:absolute;mso-position-horizontal-relative:text;mso-position-vertical:absolute;mso-position-vertical-relative:text;mso-width-percent:0;mso-height-percent:0;mso-width-relative:margin;mso-height-relative:margin;v-text-anchor:top" o:gfxdata="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" stroked="f">
+              <v:textbox>
+                <w:txbxContent>
+                  <w:p>
+                    <w:pPr>
+                      <w:rPr>
+                        <w:rFonts w:ascii="Arial" w:hAnsi="Arial" w:cs="Arial"/>
+                        <w:sz w:val="24"/>
+                        <w:szCs w:val="24"/>
+                        <w:lang w:val="pt-BR"/>
+                      </w:rPr>
+                    </w:pPr>
+                    <w:r>
+                      <w:rPr>
+                        <w:sz w:val="28"/>
+                        <w:szCs w:val="28"/>
+                        <w:lang w:val="pt"/>
+                      </w:rPr>
+                      <w:t xml:space="preserve">     </w:t>
+                    </w:r>
+                    <w:r>
+                      <w:rPr>
+                        <w:sz w:val="28"/>
+                        <w:szCs w:val="28"/>
+                        <w:lang w:val="pt"/>
+                      </w:rPr>
+                      <w:t>MUNICÍPIO DE CENTENÁRIO DO SUL</w:t>
+                    </w:r>
+                    <w:r>
+                      <w:rPr>
+                        <w:sz w:val="28"/>
+                        <w:szCs w:val="28"/>
+                        <w:lang w:val="pt"/>
+                      </w:rPr>
+                      <w:t xml:space="preserve"> – PARANÁ</w:t>
+                    </w:r>
+                    <w:r>
+                      <w:rPr>
+                        <w:lang w:val="pt"/>
+                      </w:rPr>
+                      <w:br/>
+                    </w:r>
+                    <w:r>
+                      <w:rPr>
+                        <w:lang w:val="pt"/>
+                      </w:rPr>
+                      <w:t>Paço Municipal Praça Padre</w:t>
+                    </w:r>
+                    <w:r>
+                      <w:rPr>
+                        <w:lang w:val="pt"/>
+                      </w:rPr>
+                      <w:t xml:space="preserve"> </w:t>
+                    </w:r>
+                    <w:r>
+                      <w:rPr>
+                        <w:lang w:val="pt"/>
+                      </w:rPr>
+                      <w:t>Aurélio</w:t>
+                    </w:r>
+                    <w:r>
+                      <w:rPr>
+                        <w:lang w:val="pt"/>
+                      </w:rPr>
+                      <w:t xml:space="preserve"> </w:t>
+                    </w:r>
+                    <w:r>
+                      <w:rPr>
+                        <w:lang w:val="pt"/>
+                      </w:rPr>
+                      <w:t>Baixa, 378</w:t>
+                    </w:r>
+                    <w:r>
+                      <w:rPr>
+                        <w:lang w:val="pt"/>
+                      </w:rPr>
+                      <w:t xml:space="preserve"> –Centro </w:t>
+                    </w:r>
+                    <w:r>
+                      <w:rPr>
+                        <w:lang w:val="pt"/>
+                      </w:rPr>
+                      <w:t xml:space="preserve">         Estado do Paraná</w:t>
+                    </w:r>
+                    <w:r>
+                      <w:rPr>
+                        <w:lang w:val="pt"/>
+                      </w:rPr>
+                      <w:br/>
+                    </w:r>
+                    <w:hyperlink r:id="rId3" w:history="1">
+                      <w:r>
+                        <w:rPr>
+                          <w:rStyle w:val="Hyperlink"/>
+                          <w:color w:val="000000" w:themeColor="text1"/>
+                          <w:u w:val="none"/>
+                          <w:lang w:val="pt"/>
+                        </w:rPr>
+                        <w:t>www.centenariodosul.pr.gov.br</w:t>
+                      </w:r>
+                    </w:hyperlink>
+                    <w:r>
+                      <w:rPr>
+                        <w:lang w:val="pt"/>
+                      </w:rPr>
+                      <w:t xml:space="preserve"> | </w:t>
+                    </w:r>
+                    <w:r>
+                      <w:rPr>
+                        <w:lang w:val="pt"/>
+                      </w:rPr>
+                      <w:t>CNPJ: 75.845.503/0001-67</w:t>
+                    </w:r>
+                    <w:r>
+                      <w:rPr>
+                        <w:lang w:val="pt"/>
+                      </w:rPr>
+                      <w:br/>
+                      <w:t>Fone:</w:t>
+                    </w:r>
+                    <w:r>
+                      <w:rPr>
+                        <w:lang w:val="pt"/>
+                      </w:rPr>
+                      <w:t xml:space="preserve"> (43) 3675-80</w:t>
+                    </w:r>
+                    <w:r>
+                      <w:rPr>
+                        <w:lang w:val="pt"/>
+                      </w:rPr>
+                      <w:t>0</w:t>
+                    </w:r>
+                    <w:r>
+                      <w:rPr>
+                        <w:lang w:val="pt"/>
+                      </w:rPr>
+                      <w:t>0</w:t>
+                    </w:r>
+                    <w:r>
+                      <w:rPr>
+                        <w:lang w:val="pt"/>
+                      </w:rPr>
+                      <w:t xml:space="preserve"> </w:t>
+                    </w:r>
+                    <w:r>
+                      <w:rPr>
+                        <w:lang w:val="pt"/>
+                      </w:rPr>
+                      <w:t>|</w:t>
+                    </w:r>
+                    <w:r>
+                      <w:rPr>
+                        <w:lang w:val="pt"/>
+                      </w:rPr>
+                      <w:t xml:space="preserve"> </w:t>
+                    </w:r>
+                    <w:r>
+                      <w:rPr>
+                        <w:lang w:val="pt"/>
+                      </w:rPr>
+                      <w:t>BOLSO</w:t>
+                    </w:r>
+                    <w:r>
+                      <w:rPr>
+                        <w:lang w:val="pt"/>
+                      </w:rPr>
+                      <w:t>:</w:t>
+                    </w:r>
+                    <w:r>
+                      <w:rPr>
+                        <w:lang w:val="pt"/>
+                      </w:rPr>
+                      <w:t xml:space="preserve"> 86.630-000</w:t>
+                    </w:r>
+                    <w:r>
+                      <w:rPr>
+                        <w:lang w:val="pt"/>
+                      </w:rPr>
+                      <w:t xml:space="preserve"> |</w:t>
+                    </w:r>
+                    <w:r>
+                      <w:rPr>
+                        <w:lang w:val="pt"/>
+                      </w:rPr>
+                      <w:t xml:space="preserve"> </w:t>
+                    </w:r>
+                    <w:r>
+                      <w:rPr>
+                        <w:sz w:val="21"/>
+                        <w:lang w:val="pt"/>
+                      </w:rPr>
+                      <w:t xml:space="preserve">E-mail: </w:t>
+                    </w:r>
+                    <w:r>
+                      <w:rPr>
+                        <w:sz w:val="21"/>
+                        <w:lang w:val="pt"/>
+                      </w:rPr>
+                      <w:t>contato</w:t>
+                    </w:r>
+                    <w:r>
+                      <w:rPr>
+                        <w:sz w:val="21"/>
+                        <w:lang w:val="pt"/>
+                      </w:rPr>
+                      <w:t>@centenariodosul.pr.gov.br</w:t>
+                    </w:r>
+                  </w:p>
+                </w:txbxContent>
+              </v:textbox>
+              <w10:wrap type="square"/>
+            </v:shape>
+          </w:pict>
+        </mc:Fallback>
+      </mc:AlternateContent>
     </w:r>
     <w:r>
       <w:rPr>
-        <w:rFonts w:ascii="Arial" w:hAnsi="Arial" w:cs="Arial"/>
         <w:noProof/>
         <w:sz w:val="20"/>
         <w:szCs w:val="20"/>
-        <w:lang w:eastAsia="pt-BR"/>
+        <w:lang w:val="pt"/>
       </w:rPr>
-      <w:pict w14:anchorId="041056BD">
-        <v:line id="Conector reto 12" o:spid="_x0000_s1027" style="position:absolute;flip:y;z-index:251661312;visibility:visible;mso-position-horizontal-relative:text;mso-position-vertical-relative:text" from="44.7pt,21.45pt" to="451.2pt,22.2pt" o:gfxdata="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" strokecolor="black [3213]" strokeweight="3pt">
-          <v:stroke joinstyle="miter"/>
-        </v:line>
-      </w:pict>
+      <mc:AlternateContent>
+        <mc:Choice Requires="wps">
+          <w:drawing>
+            <wp:anchor distT="0" distB="0" distL="114300" distR="114300" simplePos="0" relativeHeight="251661312" behindDoc="0" locked="0" layoutInCell="1" allowOverlap="1" wp14:anchorId="041056BD" wp14:editId="77708F32">
+              <wp:simplePos x="0" y="0"/>
+              <wp:positionH relativeFrom="column">
+                <wp:posOffset>567690</wp:posOffset>
+              </wp:positionH>
+              <wp:positionV relativeFrom="paragraph">
+                <wp:posOffset>272415</wp:posOffset>
+              </wp:positionV>
+              <wp:extent cx="5162550" cy="9525"/>
+              <wp:effectExtent l="19050" t="19050" r="0" b="9525"/>
+              <wp:wrapNone/>
+              <wp:docPr id="12" name="Conector reto 12"/>
+              <wp:cNvGraphicFramePr>
+                <a:graphicFrameLocks xmlns:a="http://schemas.openxmlformats.org/drawingml/2006/main"/>
+              </wp:cNvGraphicFramePr>
+              <a:graphic xmlns:a="http://schemas.openxmlformats.org/drawingml/2006/main">
+                <a:graphicData uri="http://schemas.microsoft.com/office/word/2010/wordprocessingShape">
+                  <wps:wsp>
+                    <wps:cNvCnPr>
+                      <a:cxnSpLocks/>
+                    </wps:cNvCnPr>
+                    <wps:spPr>
+                      <a:xfrm flipV="1">
+                        <a:off x="0" y="0"/>
+                        <a:ext cx="5162550" cy="9525"/>
+                      </a:xfrm>
+                      <a:prstGeom prst="line">
+                        <a:avLst/>
+                      </a:prstGeom>
+                      <a:ln w="38100">
+                        <a:solidFill>
+                          <a:schemeClr val="tx1"/>
+                        </a:solidFill>
+                      </a:ln>
+                    </wps:spPr>
+                    <wps:style>
+                      <a:lnRef idx="1">
+                        <a:schemeClr val="accent1"/>
+                      </a:lnRef>
+                      <a:fillRef idx="0">
+                        <a:schemeClr val="accent1"/>
+                      </a:fillRef>
+                      <a:effectRef idx="0">
+                        <a:schemeClr val="accent1"/>
+                      </a:effectRef>
+                      <a:fontRef idx="minor">
+                        <a:schemeClr val="tx1"/>
+                      </a:fontRef>
+                    </wps:style>
+                    <wps:bodyPr/>
+                  </wps:wsp>
+                </a:graphicData>
+              </a:graphic>
+              <wp14:sizeRelH relativeFrom="page">
+                <wp14:pctWidth>0</wp14:pctWidth>
+              </wp14:sizeRelH>
+              <wp14:sizeRelV relativeFrom="page">
+                <wp14:pctHeight>0</wp14:pctHeight>
+              </wp14:sizeRelV>
+            </wp:anchor>
+          </w:drawing>
+        </mc:Choice>
+        <mc:Fallback>
+          <w:pict>
+            <v:line w14:anchorId="25C0E861" id="Conector reto 12" o:spid="_x0000_s1026" style="position:absolute;flip:y;z-index:251661312;visibility:visible;mso-wrap-style:square;mso-width-percent:0;mso-height-percent:0;mso-wrap-distance-left:9pt;mso-wrap-distance-top:0;mso-wrap-distance-right:9pt;mso-wrap-distance-bottom:0;mso-position-horizontal:absolute;mso-position-horizontal-relative:text;mso-position-vertical:absolute;mso-position-vertical-relative:text;mso-width-percent:0;mso-height-percent:0;mso-width-relative:page;mso-height-relative:page" from="44.7pt,21.45pt" to="451.2pt,22.2pt" o:gfxdata="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" strokecolor="black [3213]" strokeweight="3pt">
+              <v:stroke joinstyle="miter"/>
+              <o:lock v:ext="edit" shapetype="f"/>
+            </v:line>
+          </w:pict>
+        </mc:Fallback>
+      </mc:AlternateContent>
     </w:r>
     <w:r>
       <w:rPr>
-        <w:rFonts w:ascii="Arial" w:hAnsi="Arial" w:cs="Arial"/>
         <w:noProof/>
         <w:sz w:val="20"/>
         <w:szCs w:val="20"/>
-        <w:lang w:eastAsia="pt-BR"/>
+        <w:lang w:val="pt"/>
       </w:rPr>
       <w:drawing>
         <wp:anchor distT="0" distB="0" distL="114300" distR="114300" simplePos="0" relativeHeight="251660288" behindDoc="1" locked="0" layoutInCell="1" allowOverlap="1" wp14:anchorId="0AF78D75" wp14:editId="55FA72BB">
@@ -659,7 +976,7 @@
                   <pic:cNvPicPr/>
                 </pic:nvPicPr>
                 <pic:blipFill>
-                  <a:blip r:embed="rId3">
+                  <a:blip r:embed="rId4">
                     <a:extLst>
                       <a:ext uri="{28A0092B-C50C-407E-A947-70E740481C1C}">
                         <a14:useLocalDpi xmlns:a14="http://schemas.microsoft.com/office/drawing/2010/main" val="0"/>
@@ -690,7 +1007,7 @@
 </file>
 
 <file path=word/header3.xml><?xml version="1.0" encoding="utf-8"?>
-<w:hdr xmlns:wpc="http://schemas.microsoft.com/office/word/2010/wordprocessingCanvas" xmlns:cx="http://schemas.microsoft.com/office/drawing/2014/chartex" xmlns:cx1="http://schemas.microsoft.com/office/drawing/2015/9/8/chartex" xmlns:cx2="http://schemas.microsoft.com/office/drawing/2015/10/21/chartex" xmlns:cx3="http://schemas.microsoft.com/office/drawing/2016/5/9/chartex" xmlns:cx4="http://schemas.microsoft.com/office/drawing/2016/5/10/chartex" xmlns:cx5="http://schemas.microsoft.com/office/drawing/2016/5/11/chartex" xmlns:cx6="http://schemas.microsoft.com/office/drawing/2016/5/12/chartex" xmlns:cx7="http://schemas.microsoft.com/office/drawing/2016/5/13/chartex" xmlns:cx8="http://schemas.microsoft.com/office/drawing/2016/5/14/chartex" xmlns:mc="http://schemas.openxmlformats.org/markup-compatibility/2006" xmlns:aink="http://schemas.microsoft.com/office/drawing/2016/ink" xmlns:am3d="http://schemas.microsoft.com/office/drawing/2017/model3d" xmlns:o="urn:schemas-microsoft-com:office:office" xmlns:r="http://schemas.openxmlformats.org/officeDocument/2006/relationships" xmlns:m="http://schemas.openxmlformats.org/officeDocument/2006/math" xmlns:v="urn:schemas-microsoft-com:vml" xmlns:wp14="http://schemas.microsoft.com/office/word/2010/wordprocessingDrawing" xmlns:wp="http://schemas.openxmlformats.org/drawingml/2006/wordprocessingDrawing" xmlns:w10="urn:schemas-microsoft-com:office:word" xmlns:w="http://schemas.openxmlformats.org/wordprocessingml/2006/main" xmlns:w14="http://schemas.microsoft.com/office/word/2010/wordml" xmlns:w15="http://schemas.microsoft.com/office/word/2012/wordml" xmlns:w16cex="http://schemas.microsoft.com/office/word/2018/wordml/cex" xmlns:w16cid="http://schemas.microsoft.com/office/word/2016/wordml/cid" xmlns:w16="http://schemas.microsoft.com/office/word/2018/wordml" xmlns:w16sdtdh="http://schemas.microsoft.com/office/word/2020/wordml/sdtdatahash" xmlns:w16se="http://schemas.microsoft.com/office/word/2015/wordml/symex" xmlns:wpg="http://schemas.microsoft.com/office/word/2010/wordprocessingGroup" xmlns:wpi="http://schemas.microsoft.com/office/word/2010/wordprocessingInk" xmlns:wne="http://schemas.microsoft.com/office/word/2006/wordml" xmlns:wps="http://schemas.microsoft.com/office/word/2010/wordprocessingShape" mc:Ignorable="w14 w15 w16se w16cid w16 w16cex w16sdtdh wp14">
+<w:hdr xmlns:wpc="http://schemas.microsoft.com/office/word/2010/wordprocessingCanvas" xmlns:cx="http://schemas.microsoft.com/office/drawing/2014/chartex" xmlns:cx1="http://schemas.microsoft.com/office/drawing/2015/9/8/chartex" xmlns:cx2="http://schemas.microsoft.com/office/drawing/2015/10/21/chartex" xmlns:cx3="http://schemas.microsoft.com/office/drawing/2016/5/9/chartex" xmlns:cx4="http://schemas.microsoft.com/office/drawing/2016/5/10/chartex" xmlns:cx5="http://schemas.microsoft.com/office/drawing/2016/5/11/chartex" xmlns:cx6="http://schemas.microsoft.com/office/drawing/2016/5/12/chartex" xmlns:cx7="http://schemas.microsoft.com/office/drawing/2016/5/13/chartex" xmlns:cx8="http://schemas.microsoft.com/office/drawing/2016/5/14/chartex" xmlns:mc="http://schemas.openxmlformats.org/markup-compatibility/2006" xmlns:aink="http://schemas.microsoft.com/office/drawing/2016/ink" xmlns:am3d="http://schemas.microsoft.com/office/drawing/2017/model3d" xmlns:o="urn:schemas-microsoft-com:office:office" xmlns:oel="http://schemas.microsoft.com/office/2019/extlst" xmlns:r="http://schemas.openxmlformats.org/officeDocument/2006/relationships" xmlns:m="http://schemas.openxmlformats.org/officeDocument/2006/math" xmlns:v="urn:schemas-microsoft-com:vml" xmlns:wp14="http://schemas.microsoft.com/office/word/2010/wordprocessingDrawing" xmlns:wp="http://schemas.openxmlformats.org/drawingml/2006/wordprocessingDrawing" xmlns:w10="urn:schemas-microsoft-com:office:word" xmlns:w="http://schemas.openxmlformats.org/wordprocessingml/2006/main" xmlns:w14="http://schemas.microsoft.com/office/word/2010/wordml" xmlns:w15="http://schemas.microsoft.com/office/word/2012/wordml" xmlns:w16cex="http://schemas.microsoft.com/office/word/2018/wordml/cex" xmlns:w16cid="http://schemas.microsoft.com/office/word/2016/wordml/cid" xmlns:w16="http://schemas.microsoft.com/office/word/2018/wordml" xmlns:w16sdtdh="http://schemas.microsoft.com/office/word/2020/wordml/sdtdatahash" xmlns:w16se="http://schemas.microsoft.com/office/word/2015/wordml/symex" xmlns:wpg="http://schemas.microsoft.com/office/word/2010/wordprocessingGroup" xmlns:wpi="http://schemas.microsoft.com/office/word/2010/wordprocessingInk" xmlns:wne="http://schemas.microsoft.com/office/word/2006/wordml" xmlns:wps="http://schemas.microsoft.com/office/word/2010/wordprocessingShape" mc:Ignorable="w14 w15 w16se w16cid w16 w16cex w16sdtdh wp14">
   <w:p>
     <w:pPr>
       <w:pStyle w:val="Cabealho"/>
@@ -698,6 +1015,7 @@
     <w:r>
       <w:rPr>
         <w:noProof/>
+        <w:lang w:val="pt"/>
       </w:rPr>
       <w:pict w14:anchorId="03380F72">
         <v:shapetype id="_x0000_t75" coordsize="21600,21600" o:spt="75" o:preferrelative="t" path="m@4@5l@4@11@9@11@9@5xe" filled="f" stroked="f">
@@ -730,7 +1048,7 @@
 </file>
 
 <file path=word/numbering.xml><?xml version="1.0" encoding="utf-8"?>
-<w:numbering xmlns:wpc="http://schemas.microsoft.com/office/word/2010/wordprocessingCanvas" xmlns:cx="http://schemas.microsoft.com/office/drawing/2014/chartex" xmlns:cx1="http://schemas.microsoft.com/office/drawing/2015/9/8/chartex" xmlns:cx2="http://schemas.microsoft.com/office/drawing/2015/10/21/chartex" xmlns:cx3="http://schemas.microsoft.com/office/drawing/2016/5/9/chartex" xmlns:cx4="http://schemas.microsoft.com/office/drawing/2016/5/10/chartex" xmlns:cx5="http://schemas.microsoft.com/office/drawing/2016/5/11/chartex" xmlns:cx6="http://schemas.microsoft.com/office/drawing/2016/5/12/chartex" xmlns:cx7="http://schemas.microsoft.com/office/drawing/2016/5/13/chartex" xmlns:cx8="http://schemas.microsoft.com/office/drawing/2016/5/14/chartex" xmlns:mc="http://schemas.openxmlformats.org/markup-compatibility/2006" xmlns:aink="http://schemas.microsoft.com/office/drawing/2016/ink" xmlns:am3d="http://schemas.microsoft.com/office/drawing/2017/model3d" xmlns:o="urn:schemas-microsoft-com:office:office" xmlns:r="http://schemas.openxmlformats.org/officeDocument/2006/relationships" xmlns:m="http://schemas.openxmlformats.org/officeDocument/2006/math" xmlns:v="urn:schemas-microsoft-com:vml" xmlns:wp14="http://schemas.microsoft.com/office/word/2010/wordprocessingDrawing" xmlns:wp="http://schemas.openxmlformats.org/drawingml/2006/wordprocessingDrawing" xmlns:w10="urn:schemas-microsoft-com:office:word" xmlns:w="http://schemas.openxmlformats.org/wordprocessingml/2006/main" xmlns:w14="http://schemas.microsoft.com/office/word/2010/wordml" xmlns:w15="http://schemas.microsoft.com/office/word/2012/wordml" xmlns:w16cex="http://schemas.microsoft.com/office/word/2018/wordml/cex" xmlns:w16cid="http://schemas.microsoft.com/office/word/2016/wordml/cid" xmlns:w16="http://schemas.microsoft.com/office/word/2018/wordml" xmlns:w16sdtdh="http://schemas.microsoft.com/office/word/2020/wordml/sdtdatahash" xmlns:w16se="http://schemas.microsoft.com/office/word/2015/wordml/symex" xmlns:wpg="http://schemas.microsoft.com/office/word/2010/wordprocessingGroup" xmlns:wpi="http://schemas.microsoft.com/office/word/2010/wordprocessingInk" xmlns:wne="http://schemas.microsoft.com/office/word/2006/wordml" xmlns:wps="http://schemas.microsoft.com/office/word/2010/wordprocessingShape" mc:Ignorable="w14 w15 w16se w16cid w16 w16cex w16sdtdh wp14">
+<w:numbering xmlns:wpc="http://schemas.microsoft.com/office/word/2010/wordprocessingCanvas" xmlns:cx="http://schemas.microsoft.com/office/drawing/2014/chartex" xmlns:cx1="http://schemas.microsoft.com/office/drawing/2015/9/8/chartex" xmlns:cx2="http://schemas.microsoft.com/office/drawing/2015/10/21/chartex" xmlns:cx3="http://schemas.microsoft.com/office/drawing/2016/5/9/chartex" xmlns:cx4="http://schemas.microsoft.com/office/drawing/2016/5/10/chartex" xmlns:cx5="http://schemas.microsoft.com/office/drawing/2016/5/11/chartex" xmlns:cx6="http://schemas.microsoft.com/office/drawing/2016/5/12/chartex" xmlns:cx7="http://schemas.microsoft.com/office/drawing/2016/5/13/chartex" xmlns:cx8="http://schemas.microsoft.com/office/drawing/2016/5/14/chartex" xmlns:mc="http://schemas.openxmlformats.org/markup-compatibility/2006" xmlns:aink="http://schemas.microsoft.com/office/drawing/2016/ink" xmlns:am3d="http://schemas.microsoft.com/office/drawing/2017/model3d" xmlns:o="urn:schemas-microsoft-com:office:office" xmlns:oel="http://schemas.microsoft.com/office/2019/extlst" xmlns:r="http://schemas.openxmlformats.org/officeDocument/2006/relationships" xmlns:m="http://schemas.openxmlformats.org/officeDocument/2006/math" xmlns:v="urn:schemas-microsoft-com:vml" xmlns:wp14="http://schemas.microsoft.com/office/word/2010/wordprocessingDrawing" xmlns:wp="http://schemas.openxmlformats.org/drawingml/2006/wordprocessingDrawing" xmlns:w10="urn:schemas-microsoft-com:office:word" xmlns:w="http://schemas.openxmlformats.org/wordprocessingml/2006/main" xmlns:w14="http://schemas.microsoft.com/office/word/2010/wordml" xmlns:w15="http://schemas.microsoft.com/office/word/2012/wordml" xmlns:w16cex="http://schemas.microsoft.com/office/word/2018/wordml/cex" xmlns:w16cid="http://schemas.microsoft.com/office/word/2016/wordml/cid" xmlns:w16="http://schemas.microsoft.com/office/word/2018/wordml" xmlns:w16sdtdh="http://schemas.microsoft.com/office/word/2020/wordml/sdtdatahash" xmlns:w16se="http://schemas.microsoft.com/office/word/2015/wordml/symex" xmlns:wpg="http://schemas.microsoft.com/office/word/2010/wordprocessingGroup" xmlns:wpi="http://schemas.microsoft.com/office/word/2010/wordprocessingInk" xmlns:wne="http://schemas.microsoft.com/office/word/2006/wordml" xmlns:wps="http://schemas.microsoft.com/office/word/2010/wordprocessingShape" mc:Ignorable="w14 w15 w16se w16cid w16 w16cex w16sdtdh wp14">
   <w:abstractNum w:abstractNumId="0" w15:restartNumberingAfterBreak="0">
     <w:nsid w:val="36DE2C52"/>
     <w:multiLevelType w:val="hybridMultilevel"/>
@@ -905,13 +1223,13 @@
       <w:lvlJc w:val="left"/>
     </w:lvl>
   </w:abstractNum>
-  <w:num w:numId="1">
+  <w:num w:numId="1" w16cid:durableId="1215040565">
     <w:abstractNumId w:val="0"/>
   </w:num>
-  <w:num w:numId="2">
+  <w:num w:numId="2" w16cid:durableId="2143183715">
     <w:abstractNumId w:val="1"/>
   </w:num>
-  <w:num w:numId="3">
+  <w:num w:numId="3" w16cid:durableId="2128115543">
     <w:abstractNumId w:val="1"/>
     <w:lvlOverride w:ilvl="0">
       <w:startOverride w:val="1"/>

</xml_diff>